<commit_message>
Documento: carátula, índice y reseñas con los 3 integrantes del Grupo 2
Nombres y carnés reales en la carátula y en las reseñas, reparto de
responsables del índice redistribuido entre 3 (propuesta por confirmar) y
se elimina el cuarto espacio de reseña. Quedan resaltados los datos
pendientes: porcentajes, catedrático, reseñas personales y URL del sitio.

Co-Authored-By: Claude Sonnet 5.5 <noreply@anthropic.com>
</commit_message>
<xml_diff>
--- a/documento/Proyecto_Final_MAXPRO2.docx
+++ b/documento/Proyecto_Final_MAXPRO2.docx
@@ -137,7 +137,7 @@
           <w:sz w:val="24"/>
           <w:szCs w:val="24"/>
         </w:rPr>
-        <w:t xml:space="preserve">Integrantes del grupo</w:t>
+        <w:t xml:space="preserve">Integrantes del Grupo 2</w:t>
       </w:r>
     </w:p>
     <w:tbl>
@@ -312,9 +312,8 @@
               <w:rPr>
                 <w:sz w:val="22"/>
                 <w:szCs w:val="22"/>
-                <w:highlight w:val="yellow"/>
-              </w:rPr>
-              <w:t xml:space="preserve">[Nombre completo del integrante 1]</w:t>
+              </w:rPr>
+              <w:t xml:space="preserve">Mario Josue López Rodas</w:t>
             </w:r>
           </w:p>
         </w:tc>
@@ -336,9 +335,8 @@
               <w:rPr>
                 <w:sz w:val="22"/>
                 <w:szCs w:val="22"/>
-                <w:highlight w:val="yellow"/>
-              </w:rPr>
-              <w:t xml:space="preserve">[Carné]</w:t>
+              </w:rPr>
+              <w:t xml:space="preserve">0900-22-9412</w:t>
             </w:r>
           </w:p>
         </w:tc>
@@ -362,7 +360,7 @@
                 <w:szCs w:val="22"/>
                 <w:highlight w:val="yellow"/>
               </w:rPr>
-              <w:t xml:space="preserve">25 %</w:t>
+              <w:t xml:space="preserve">[%]</w:t>
             </w:r>
           </w:p>
         </w:tc>
@@ -409,9 +407,8 @@
               <w:rPr>
                 <w:sz w:val="22"/>
                 <w:szCs w:val="22"/>
-                <w:highlight w:val="yellow"/>
-              </w:rPr>
-              <w:t xml:space="preserve">[Nombre completo del integrante 2]</w:t>
+              </w:rPr>
+              <w:t xml:space="preserve">Josue Wilfredo Estrada Recinos</w:t>
             </w:r>
           </w:p>
         </w:tc>
@@ -433,9 +430,8 @@
               <w:rPr>
                 <w:sz w:val="22"/>
                 <w:szCs w:val="22"/>
-                <w:highlight w:val="yellow"/>
-              </w:rPr>
-              <w:t xml:space="preserve">[Carné]</w:t>
+              </w:rPr>
+              <w:t xml:space="preserve">0900-22-18429</w:t>
             </w:r>
           </w:p>
         </w:tc>
@@ -459,7 +455,7 @@
                 <w:szCs w:val="22"/>
                 <w:highlight w:val="yellow"/>
               </w:rPr>
-              <w:t xml:space="preserve">25 %</w:t>
+              <w:t xml:space="preserve">[%]</w:t>
             </w:r>
           </w:p>
         </w:tc>
@@ -506,9 +502,8 @@
               <w:rPr>
                 <w:sz w:val="22"/>
                 <w:szCs w:val="22"/>
-                <w:highlight w:val="yellow"/>
-              </w:rPr>
-              <w:t xml:space="preserve">[Nombre completo del integrante 3]</w:t>
+              </w:rPr>
+              <w:t xml:space="preserve">Francisco Javier Barrios Saenz De Tejada</w:t>
             </w:r>
           </w:p>
         </w:tc>
@@ -530,9 +525,8 @@
               <w:rPr>
                 <w:sz w:val="22"/>
                 <w:szCs w:val="22"/>
-                <w:highlight w:val="yellow"/>
-              </w:rPr>
-              <w:t xml:space="preserve">[Carné]</w:t>
+              </w:rPr>
+              <w:t xml:space="preserve">0900-21-1146</w:t>
             </w:r>
           </w:p>
         </w:tc>
@@ -556,104 +550,7 @@
                 <w:szCs w:val="22"/>
                 <w:highlight w:val="yellow"/>
               </w:rPr>
-              <w:t xml:space="preserve">25 %</w:t>
-            </w:r>
-          </w:p>
-        </w:tc>
-      </w:tr>
-      <w:tr>
-        <w:trPr>
-          <w:cantSplit/>
-        </w:trPr>
-        <w:tc>
-          <w:tcPr>
-            <w:tcW w:w="700" w:type="dxa"/>
-            <w:tcMar>
-              <w:top w:w="80" w:type="dxa"/>
-              <w:left w:w="100" w:type="dxa"/>
-              <w:bottom w:w="80" w:type="dxa"/>
-              <w:right w:w="100" w:type="dxa"/>
-            </w:tcMar>
-          </w:tcPr>
-          <w:p>
-            <w:pPr>
-              <w:jc w:val="center"/>
-            </w:pPr>
-            <w:r>
-              <w:rPr>
-                <w:sz w:val="22"/>
-                <w:szCs w:val="22"/>
-              </w:rPr>
-              <w:t xml:space="preserve">4</w:t>
-            </w:r>
-          </w:p>
-        </w:tc>
-        <w:tc>
-          <w:tcPr>
-            <w:tcW w:w="4300" w:type="dxa"/>
-            <w:tcMar>
-              <w:top w:w="80" w:type="dxa"/>
-              <w:left w:w="100" w:type="dxa"/>
-              <w:bottom w:w="80" w:type="dxa"/>
-              <w:right w:w="100" w:type="dxa"/>
-            </w:tcMar>
-          </w:tcPr>
-          <w:p>
-            <w:r>
-              <w:rPr>
-                <w:sz w:val="22"/>
-                <w:szCs w:val="22"/>
-                <w:highlight w:val="yellow"/>
-              </w:rPr>
-              <w:t xml:space="preserve">[Nombre completo del integrante 4]</w:t>
-            </w:r>
-          </w:p>
-        </w:tc>
-        <w:tc>
-          <w:tcPr>
-            <w:tcW w:w="1700" w:type="dxa"/>
-            <w:tcMar>
-              <w:top w:w="80" w:type="dxa"/>
-              <w:left w:w="100" w:type="dxa"/>
-              <w:bottom w:w="80" w:type="dxa"/>
-              <w:right w:w="100" w:type="dxa"/>
-            </w:tcMar>
-          </w:tcPr>
-          <w:p>
-            <w:pPr>
-              <w:jc w:val="center"/>
-            </w:pPr>
-            <w:r>
-              <w:rPr>
-                <w:sz w:val="22"/>
-                <w:szCs w:val="22"/>
-                <w:highlight w:val="yellow"/>
-              </w:rPr>
-              <w:t xml:space="preserve">[Carné]</w:t>
-            </w:r>
-          </w:p>
-        </w:tc>
-        <w:tc>
-          <w:tcPr>
-            <w:tcW w:w="2422" w:type="dxa"/>
-            <w:tcMar>
-              <w:top w:w="80" w:type="dxa"/>
-              <w:left w:w="100" w:type="dxa"/>
-              <w:bottom w:w="80" w:type="dxa"/>
-              <w:right w:w="100" w:type="dxa"/>
-            </w:tcMar>
-          </w:tcPr>
-          <w:p>
-            <w:pPr>
-              <w:jc w:val="center"/>
-            </w:pPr>
-            <w:r>
-              <w:rPr>
-                <w:sz w:val="22"/>
-                <w:szCs w:val="22"/>
-                <w:highlight w:val="yellow"/>
-              </w:rPr>
-              <w:t xml:space="preserve">25 %</w:t>
+              <w:t xml:space="preserve">[%]</w:t>
             </w:r>
           </w:p>
         </w:tc>
@@ -1165,7 +1062,7 @@
                 <w:szCs w:val="21"/>
                 <w:highlight w:val="yellow"/>
               </w:rPr>
-              <w:t xml:space="preserve">Integrante 1</w:t>
+              <w:t xml:space="preserve">Mario López</w:t>
             </w:r>
           </w:p>
         </w:tc>
@@ -1267,7 +1164,7 @@
                 <w:szCs w:val="21"/>
                 <w:highlight w:val="yellow"/>
               </w:rPr>
-              <w:t xml:space="preserve">Integrante 1</w:t>
+              <w:t xml:space="preserve">Mario López</w:t>
             </w:r>
           </w:p>
         </w:tc>
@@ -1367,7 +1264,7 @@
                 <w:szCs w:val="21"/>
                 <w:highlight w:val="yellow"/>
               </w:rPr>
-              <w:t xml:space="preserve">Integrante 1</w:t>
+              <w:t xml:space="preserve">Mario López</w:t>
             </w:r>
           </w:p>
         </w:tc>
@@ -1467,7 +1364,7 @@
                 <w:szCs w:val="21"/>
                 <w:highlight w:val="yellow"/>
               </w:rPr>
-              <w:t xml:space="preserve">Integrante 1</w:t>
+              <w:t xml:space="preserve">Mario López</w:t>
             </w:r>
           </w:p>
         </w:tc>
@@ -1567,7 +1464,7 @@
                 <w:szCs w:val="21"/>
                 <w:highlight w:val="yellow"/>
               </w:rPr>
-              <w:t xml:space="preserve">Integrante 1</w:t>
+              <w:t xml:space="preserve">Mario López</w:t>
             </w:r>
           </w:p>
         </w:tc>
@@ -1667,7 +1564,7 @@
                 <w:szCs w:val="21"/>
                 <w:highlight w:val="yellow"/>
               </w:rPr>
-              <w:t xml:space="preserve">Integrante 1</w:t>
+              <w:t xml:space="preserve">Mario López</w:t>
             </w:r>
           </w:p>
         </w:tc>
@@ -1769,7 +1666,7 @@
                 <w:szCs w:val="21"/>
                 <w:highlight w:val="yellow"/>
               </w:rPr>
-              <w:t xml:space="preserve">Integrante 1</w:t>
+              <w:t xml:space="preserve">Mario López</w:t>
             </w:r>
           </w:p>
         </w:tc>
@@ -1869,7 +1766,7 @@
                 <w:szCs w:val="21"/>
                 <w:highlight w:val="yellow"/>
               </w:rPr>
-              <w:t xml:space="preserve">Integrante 1</w:t>
+              <w:t xml:space="preserve">Mario López</w:t>
             </w:r>
           </w:p>
         </w:tc>
@@ -1969,7 +1866,7 @@
                 <w:szCs w:val="21"/>
                 <w:highlight w:val="yellow"/>
               </w:rPr>
-              <w:t xml:space="preserve">Integrante 1</w:t>
+              <w:t xml:space="preserve">Mario López</w:t>
             </w:r>
           </w:p>
         </w:tc>
@@ -2069,7 +1966,7 @@
                 <w:szCs w:val="21"/>
                 <w:highlight w:val="yellow"/>
               </w:rPr>
-              <w:t xml:space="preserve">Integrante 1</w:t>
+              <w:t xml:space="preserve">Mario López</w:t>
             </w:r>
           </w:p>
         </w:tc>
@@ -2169,7 +2066,7 @@
                 <w:szCs w:val="21"/>
                 <w:highlight w:val="yellow"/>
               </w:rPr>
-              <w:t xml:space="preserve">Integrante 1</w:t>
+              <w:t xml:space="preserve">Mario López</w:t>
             </w:r>
           </w:p>
         </w:tc>
@@ -2269,7 +2166,7 @@
                 <w:szCs w:val="21"/>
                 <w:highlight w:val="yellow"/>
               </w:rPr>
-              <w:t xml:space="preserve">Integrante 1</w:t>
+              <w:t xml:space="preserve">Mario López</w:t>
             </w:r>
           </w:p>
         </w:tc>
@@ -2369,7 +2266,7 @@
                 <w:szCs w:val="21"/>
                 <w:highlight w:val="yellow"/>
               </w:rPr>
-              <w:t xml:space="preserve">Integrante 1</w:t>
+              <w:t xml:space="preserve">Mario López</w:t>
             </w:r>
           </w:p>
         </w:tc>
@@ -2469,7 +2366,7 @@
                 <w:szCs w:val="21"/>
                 <w:highlight w:val="yellow"/>
               </w:rPr>
-              <w:t xml:space="preserve">Integrante 1</w:t>
+              <w:t xml:space="preserve">Mario López</w:t>
             </w:r>
           </w:p>
         </w:tc>
@@ -2571,7 +2468,7 @@
                 <w:szCs w:val="21"/>
                 <w:highlight w:val="yellow"/>
               </w:rPr>
-              <w:t xml:space="preserve">Integrante 1 / Integrante 2</w:t>
+              <w:t xml:space="preserve">Mario López / Josue Estrada</w:t>
             </w:r>
           </w:p>
         </w:tc>
@@ -2671,7 +2568,7 @@
                 <w:szCs w:val="21"/>
                 <w:highlight w:val="yellow"/>
               </w:rPr>
-              <w:t xml:space="preserve">Integrante 1</w:t>
+              <w:t xml:space="preserve">Mario López</w:t>
             </w:r>
           </w:p>
         </w:tc>
@@ -2771,7 +2668,7 @@
                 <w:szCs w:val="21"/>
                 <w:highlight w:val="yellow"/>
               </w:rPr>
-              <w:t xml:space="preserve">Integrante 1</w:t>
+              <w:t xml:space="preserve">Mario López</w:t>
             </w:r>
           </w:p>
         </w:tc>
@@ -2871,7 +2768,7 @@
                 <w:szCs w:val="21"/>
                 <w:highlight w:val="yellow"/>
               </w:rPr>
-              <w:t xml:space="preserve">Integrante 1</w:t>
+              <w:t xml:space="preserve">Mario López</w:t>
             </w:r>
           </w:p>
         </w:tc>
@@ -2971,7 +2868,7 @@
                 <w:szCs w:val="21"/>
                 <w:highlight w:val="yellow"/>
               </w:rPr>
-              <w:t xml:space="preserve">Integrante 2</w:t>
+              <w:t xml:space="preserve">Josue Estrada</w:t>
             </w:r>
           </w:p>
         </w:tc>
@@ -3071,7 +2968,7 @@
                 <w:szCs w:val="21"/>
                 <w:highlight w:val="yellow"/>
               </w:rPr>
-              <w:t xml:space="preserve">Integrante 2</w:t>
+              <w:t xml:space="preserve">Josue Estrada</w:t>
             </w:r>
           </w:p>
         </w:tc>
@@ -3171,7 +3068,7 @@
                 <w:szCs w:val="21"/>
                 <w:highlight w:val="yellow"/>
               </w:rPr>
-              <w:t xml:space="preserve">Integrante 2</w:t>
+              <w:t xml:space="preserve">Josue Estrada</w:t>
             </w:r>
           </w:p>
         </w:tc>
@@ -3271,7 +3168,7 @@
                 <w:szCs w:val="21"/>
                 <w:highlight w:val="yellow"/>
               </w:rPr>
-              <w:t xml:space="preserve">Integrante 2</w:t>
+              <w:t xml:space="preserve">Josue Estrada</w:t>
             </w:r>
           </w:p>
         </w:tc>
@@ -3371,7 +3268,7 @@
                 <w:szCs w:val="21"/>
                 <w:highlight w:val="yellow"/>
               </w:rPr>
-              <w:t xml:space="preserve">Integrante 2</w:t>
+              <w:t xml:space="preserve">Josue Estrada</w:t>
             </w:r>
           </w:p>
         </w:tc>
@@ -3471,7 +3368,7 @@
                 <w:szCs w:val="21"/>
                 <w:highlight w:val="yellow"/>
               </w:rPr>
-              <w:t xml:space="preserve">Integrante 2</w:t>
+              <w:t xml:space="preserve">Josue Estrada</w:t>
             </w:r>
           </w:p>
         </w:tc>
@@ -3573,7 +3470,7 @@
                 <w:szCs w:val="21"/>
                 <w:highlight w:val="yellow"/>
               </w:rPr>
-              <w:t xml:space="preserve">Integrante 3</w:t>
+              <w:t xml:space="preserve">Mario López</w:t>
             </w:r>
           </w:p>
         </w:tc>
@@ -3673,7 +3570,7 @@
                 <w:szCs w:val="21"/>
                 <w:highlight w:val="yellow"/>
               </w:rPr>
-              <w:t xml:space="preserve">Integrante 3</w:t>
+              <w:t xml:space="preserve">Mario López</w:t>
             </w:r>
           </w:p>
         </w:tc>
@@ -3773,7 +3670,7 @@
                 <w:szCs w:val="21"/>
                 <w:highlight w:val="yellow"/>
               </w:rPr>
-              <w:t xml:space="preserve">Integrante 3</w:t>
+              <w:t xml:space="preserve">Mario López</w:t>
             </w:r>
           </w:p>
         </w:tc>
@@ -3873,7 +3770,7 @@
                 <w:szCs w:val="21"/>
                 <w:highlight w:val="yellow"/>
               </w:rPr>
-              <w:t xml:space="preserve">Integrante 3</w:t>
+              <w:t xml:space="preserve">Mario López</w:t>
             </w:r>
           </w:p>
         </w:tc>
@@ -3973,7 +3870,7 @@
                 <w:szCs w:val="21"/>
                 <w:highlight w:val="yellow"/>
               </w:rPr>
-              <w:t xml:space="preserve">Integrante 3</w:t>
+              <w:t xml:space="preserve">Mario López</w:t>
             </w:r>
           </w:p>
         </w:tc>
@@ -4073,7 +3970,7 @@
                 <w:szCs w:val="21"/>
                 <w:highlight w:val="yellow"/>
               </w:rPr>
-              <w:t xml:space="preserve">Integrante 3</w:t>
+              <w:t xml:space="preserve">Mario López</w:t>
             </w:r>
           </w:p>
         </w:tc>
@@ -4173,7 +4070,7 @@
                 <w:szCs w:val="21"/>
                 <w:highlight w:val="yellow"/>
               </w:rPr>
-              <w:t xml:space="preserve">Integrante 3</w:t>
+              <w:t xml:space="preserve">Mario López</w:t>
             </w:r>
           </w:p>
         </w:tc>
@@ -4275,7 +4172,7 @@
                 <w:szCs w:val="21"/>
                 <w:highlight w:val="yellow"/>
               </w:rPr>
-              <w:t xml:space="preserve">Integrante 3 / Integrante 4</w:t>
+              <w:t xml:space="preserve">Francisco Barrios</w:t>
             </w:r>
           </w:p>
         </w:tc>
@@ -4375,7 +4272,7 @@
                 <w:szCs w:val="21"/>
                 <w:highlight w:val="yellow"/>
               </w:rPr>
-              <w:t xml:space="preserve">Integrante 3</w:t>
+              <w:t xml:space="preserve">Francisco Barrios</w:t>
             </w:r>
           </w:p>
         </w:tc>
@@ -4475,7 +4372,7 @@
                 <w:szCs w:val="21"/>
                 <w:highlight w:val="yellow"/>
               </w:rPr>
-              <w:t xml:space="preserve">Integrante 3</w:t>
+              <w:t xml:space="preserve">Francisco Barrios</w:t>
             </w:r>
           </w:p>
         </w:tc>
@@ -4575,7 +4472,7 @@
                 <w:szCs w:val="21"/>
                 <w:highlight w:val="yellow"/>
               </w:rPr>
-              <w:t xml:space="preserve">Integrante 4</w:t>
+              <w:t xml:space="preserve">Francisco Barrios</w:t>
             </w:r>
           </w:p>
         </w:tc>
@@ -4675,7 +4572,7 @@
                 <w:szCs w:val="21"/>
                 <w:highlight w:val="yellow"/>
               </w:rPr>
-              <w:t xml:space="preserve">Integrante 4</w:t>
+              <w:t xml:space="preserve">Francisco Barrios</w:t>
             </w:r>
           </w:p>
         </w:tc>
@@ -4775,7 +4672,7 @@
                 <w:szCs w:val="21"/>
                 <w:highlight w:val="yellow"/>
               </w:rPr>
-              <w:t xml:space="preserve">Integrante 4</w:t>
+              <w:t xml:space="preserve">Francisco Barrios</w:t>
             </w:r>
           </w:p>
         </w:tc>
@@ -4875,7 +4772,7 @@
                 <w:szCs w:val="21"/>
                 <w:highlight w:val="yellow"/>
               </w:rPr>
-              <w:t xml:space="preserve">Integrante 4</w:t>
+              <w:t xml:space="preserve">Francisco Barrios</w:t>
             </w:r>
           </w:p>
         </w:tc>
@@ -4977,7 +4874,7 @@
                 <w:szCs w:val="21"/>
                 <w:highlight w:val="yellow"/>
               </w:rPr>
-              <w:t xml:space="preserve">Integrante 2</w:t>
+              <w:t xml:space="preserve">Josue Estrada</w:t>
             </w:r>
           </w:p>
         </w:tc>
@@ -5079,7 +4976,7 @@
                 <w:szCs w:val="21"/>
                 <w:highlight w:val="yellow"/>
               </w:rPr>
-              <w:t xml:space="preserve">Integrante 4</w:t>
+              <w:t xml:space="preserve">Josue Estrada</w:t>
             </w:r>
           </w:p>
         </w:tc>
@@ -5181,7 +5078,7 @@
                 <w:szCs w:val="21"/>
                 <w:highlight w:val="yellow"/>
               </w:rPr>
-              <w:t xml:space="preserve">Integrante 4</w:t>
+              <w:t xml:space="preserve">Josue Estrada</w:t>
             </w:r>
           </w:p>
         </w:tc>
@@ -5385,7 +5282,7 @@
                 <w:szCs w:val="21"/>
                 <w:highlight w:val="yellow"/>
               </w:rPr>
-              <w:t xml:space="preserve">Integrante 3</w:t>
+              <w:t xml:space="preserve">Mario López</w:t>
             </w:r>
           </w:p>
         </w:tc>
@@ -5487,7 +5384,7 @@
                 <w:szCs w:val="21"/>
                 <w:highlight w:val="yellow"/>
               </w:rPr>
-              <w:t xml:space="preserve">Integrante 2 / Integrante 4</w:t>
+              <w:t xml:space="preserve">Josue Estrada / Francisco Barrios</w:t>
             </w:r>
           </w:p>
         </w:tc>
@@ -5587,7 +5484,7 @@
                 <w:szCs w:val="21"/>
                 <w:highlight w:val="yellow"/>
               </w:rPr>
-              <w:t xml:space="preserve">Integrante 2</w:t>
+              <w:t xml:space="preserve">Josue Estrada</w:t>
             </w:r>
           </w:p>
         </w:tc>
@@ -5687,7 +5584,7 @@
                 <w:szCs w:val="21"/>
                 <w:highlight w:val="yellow"/>
               </w:rPr>
-              <w:t xml:space="preserve">Integrante 4</w:t>
+              <w:t xml:space="preserve">Francisco Barrios</w:t>
             </w:r>
           </w:p>
         </w:tc>
@@ -5705,7 +5602,7 @@
           <w:sz w:val="20"/>
           <w:szCs w:val="20"/>
         </w:rPr>
-        <w:t xml:space="preserve">Nota. Los responsables de cada sección son una propuesta de reparto equitativo; actualice los nombres reales del grupo.</w:t>
+        <w:t xml:space="preserve">Nota. El reparto de responsables por sección (columna resaltada) es una propuesta; el grupo debe confirmarlo o ajustarlo antes de entregar.</w:t>
       </w:r>
     </w:p>
     <w:p>
@@ -25588,9 +25485,8 @@
         <w:rPr>
           <w:b/>
           <w:bCs/>
-          <w:highlight w:val="yellow"/>
         </w:rPr>
-        <w:t>[Nombre completo del integrante 1]</w:t>
+        <w:t>Mario Josue López Rodas</w:t>
       </w:r>
     </w:p>
     <w:p>
@@ -25615,9 +25511,8 @@
         <w:rPr>
           <w:b/>
           <w:bCs/>
-          <w:highlight w:val="yellow"/>
         </w:rPr>
-        <w:t>[Nombre completo del integrante 2]</w:t>
+        <w:t>Josue Wilfredo Estrada Recinos</w:t>
       </w:r>
     </w:p>
     <w:p>
@@ -25642,36 +25537,8 @@
         <w:rPr>
           <w:b/>
           <w:bCs/>
-          <w:highlight w:val="yellow"/>
         </w:rPr>
-        <w:t>[Nombre completo del integrante 3]</w:t>
-      </w:r>
-    </w:p>
-    <w:p>
-      <w:pPr>
-        <w:spacing w:after="240" w:line="360" w:lineRule="auto"/>
-        <w:ind w:firstLine="720"/>
-        <w:jc w:val="both"/>
-      </w:pPr>
-      <w:r>
-        <w:rPr>
-          <w:highlight w:val="yellow"/>
-        </w:rPr>
-        <w:t>[Reseña personal: qué aprendió con la implementación del proyecto.]</w:t>
-      </w:r>
-    </w:p>
-    <w:p>
-      <w:pPr>
-        <w:keepNext/>
-        <w:spacing w:before="240" w:after="120" w:line="360" w:lineRule="auto"/>
-      </w:pPr>
-      <w:r>
-        <w:rPr>
-          <w:b/>
-          <w:bCs/>
-          <w:highlight w:val="yellow"/>
-        </w:rPr>
-        <w:t>[Nombre completo del integrante 4]</w:t>
+        <w:t>Francisco Javier Barrios Saenz De Tejada</w:t>
       </w:r>
     </w:p>
     <w:p>

</xml_diff>

<commit_message>
Documento y README: URL publicada del sitio en Vercel
La introducción y el Apéndice B enlazan a https://telco-final-project.vercel.app
como hipervínculo clicable. La paginación no cambia (50 páginas). El README
indica la URL del sitio.

Co-Authored-By: Claude Sonnet 5.5 <noreply@anthropic.com>
</commit_message>
<xml_diff>
--- a/documento/Proyecto_Final_MAXPRO2.docx
+++ b/documento/Proyecto_Final_MAXPRO2.docx
@@ -6696,7 +6696,19 @@
         <w:jc w:val="both"/>
       </w:pPr>
       <w:r>
-        <w:t xml:space="preserve">Cada decisión se justifica con cálculos de presupuesto de potencia óptica, capacidad inalámbrica y cobertura, así como con precios de mercado recolectados en octubre de 2026. El costo total estimado del proyecto es de USD 890,414.21 sin IVA y USD 997,263.92 con IVA, del cual el 91 % corresponde al enlace de fibra de 148 km. La solución se complementa con un sitio web interactivo con recorrido narrado y simuladores, publicado en [URL del sitio web] (Apéndice B).</w:t>
+        <w:t xml:space="preserve">Cada decisión se justifica con cálculos de presupuesto de potencia óptica, capacidad inalámbrica y cobertura, así como con precios de mercado recolectados en octubre de 2026. El costo total estimado del proyecto es de USD 890,414.21 sin IVA y USD 997,263.92 con IVA, del cual el 91 % corresponde al enlace de fibra de 148 km. La solución se complementa con un sitio web interactivo con recorrido narrado y simuladores, publicado en </w:t>
+      </w:r>
+      <w:hyperlink r:id="rId22">
+        <w:r>
+          <w:rPr>
+            <w:color w:val="0563C1"/>
+            <w:u w:val="single"/>
+          </w:rPr>
+          <w:t xml:space="preserve">https://telco-final-project.vercel.app</w:t>
+        </w:r>
+      </w:hyperlink>
+      <w:r>
+        <w:t xml:space="preserve"> (Apéndice B).</w:t>
       </w:r>
     </w:p>
     <w:p>
@@ -33843,7 +33855,19 @@
         <w:jc w:val="both"/>
       </w:pPr>
       <w:r>
-        <w:t xml:space="preserve">El proyecto se presenta en un sitio web didáctico, publicado en [URL del sitio web], que funciona en cualquier navegador moderno y sin instalación. Sus elementos principales son los siguientes.</w:t>
+        <w:t xml:space="preserve">El proyecto se presenta en un sitio web didáctico, publicado en </w:t>
+      </w:r>
+      <w:hyperlink r:id="rId22">
+        <w:r>
+          <w:rPr>
+            <w:color w:val="0563C1"/>
+            <w:u w:val="single"/>
+          </w:rPr>
+          <w:t xml:space="preserve">https://telco-final-project.vercel.app</w:t>
+        </w:r>
+      </w:hyperlink>
+      <w:r>
+        <w:t xml:space="preserve">, que funciona en cualquier navegador moderno y sin instalación. Sus elementos principales son los siguientes.</w:t>
       </w:r>
     </w:p>
     <w:p>

</xml_diff>